<commit_message>
AAP submission: reviewer-level revision of wording, accuracy and consistency
Co-Authored-By: Tatsuki Onishi <bougtoir@gmail.com>
</commit_message>
<xml_diff>
--- a/heat_accidents_mortality/output/manuscript/aap_cover_letter.docx
+++ b/heat_accidents_mortality/output/manuscript/aap_cover_letter.docx
@@ -10,7 +10,6 @@
         <w:t>[PLACEHOLDER date]</w:t>
       </w:r>
     </w:p>
-    <w:p/>
     <w:p>
       <w:pPr>
         <w:spacing w:line="276" w:lineRule="auto" w:after="120"/>
@@ -19,7 +18,6 @@
         <w:t>The Editors, Accident Analysis &amp; Prevention</w:t>
       </w:r>
     </w:p>
-    <w:p/>
     <w:p>
       <w:pPr>
         <w:spacing w:line="276" w:lineRule="auto" w:after="120"/>
@@ -28,13 +26,12 @@
         <w:t>Dear Editors,</w:t>
       </w:r>
     </w:p>
-    <w:p/>
     <w:p>
       <w:pPr>
         <w:spacing w:line="276" w:lineRule="auto" w:after="120"/>
       </w:pPr>
       <w:r>
-        <w:t xml:space="preserve">We submit for your consideration our manuscript, "Hotter-than-normal days and </w:t>
+        <w:t>We submit for your consideration our manuscript, "Hotter-than-normal days and traffic-crash mortality: a distributed-lag analysis of the United States and Japan and the question of under-recognised heat illness", as a Research Article.</w:t>
       </w:r>
     </w:p>
     <w:p>
@@ -42,7 +39,7 @@
         <w:spacing w:line="276" w:lineRule="auto" w:after="120"/>
       </w:pPr>
       <w:r>
-        <w:t xml:space="preserve">traffic-crash mortality: a distributed-lag analysis of the United States and </w:t>
+        <w:t>Using only public data, this ecological time-series study shows that days hotter than the local seasonal norm carry an acute excess of US traffic-crash deaths. The excess survives adjustment for national driving activity, is concentrated in heat-exposed open-air road users (motorcyclists, pedestrians and cyclists), and is comparable in magnitude to all officially recorded direct-heat deaths (ICD-10 X30). Scenario projections suggest this burden would grow under uniform warming. These findings are directly relevant to the journal's scope of transportation-accident injury and the environmental and human factors that influence crash occurrence and severity.</w:t>
       </w:r>
     </w:p>
     <w:p>
@@ -50,124 +47,9 @@
         <w:spacing w:line="276" w:lineRule="auto" w:after="120"/>
       </w:pPr>
       <w:r>
-        <w:t>Japan and the question of under-recognised heat illness", as a Research Article.</w:t>
+        <w:t>The manuscript is original, is not under consideration elsewhere, and all authors approve submission. All data are public and the complete analysis pipeline is openly available and fully reproducible (make all for data and figures, then make aap for the manuscript and submission package), with no hard-coded results. We declare [PLACEHOLDER competing interests]. We confirm [PLACEHOLDER preprint status].</w:t>
       </w:r>
     </w:p>
-    <w:p/>
-    <w:p>
-      <w:pPr>
-        <w:spacing w:line="276" w:lineRule="auto" w:after="120"/>
-      </w:pPr>
-      <w:r>
-        <w:t xml:space="preserve">Using only public data, this ecological time-series study shows that days hotter </w:t>
-      </w:r>
-    </w:p>
-    <w:p>
-      <w:pPr>
-        <w:spacing w:line="276" w:lineRule="auto" w:after="120"/>
-      </w:pPr>
-      <w:r>
-        <w:t xml:space="preserve">than the local seasonal norm carry an acute excess of US traffic-crash deaths. </w:t>
-      </w:r>
-    </w:p>
-    <w:p>
-      <w:pPr>
-        <w:spacing w:line="276" w:lineRule="auto" w:after="120"/>
-      </w:pPr>
-      <w:r>
-        <w:t xml:space="preserve">The excess survives adjustment for national driving activity, is concentrated </w:t>
-      </w:r>
-    </w:p>
-    <w:p>
-      <w:pPr>
-        <w:spacing w:line="276" w:lineRule="auto" w:after="120"/>
-      </w:pPr>
-      <w:r>
-        <w:t xml:space="preserve">in heat-exposed open-air road users (motorcyclists, pedestrians and cyclists), </w:t>
-      </w:r>
-    </w:p>
-    <w:p>
-      <w:pPr>
-        <w:spacing w:line="276" w:lineRule="auto" w:after="120"/>
-      </w:pPr>
-      <w:r>
-        <w:t xml:space="preserve">and is comparable in magnitude to all officially recorded direct-heat deaths </w:t>
-      </w:r>
-    </w:p>
-    <w:p>
-      <w:pPr>
-        <w:spacing w:line="276" w:lineRule="auto" w:after="120"/>
-      </w:pPr>
-      <w:r>
-        <w:t xml:space="preserve">(ICD-10 X30). Scenario projections suggest this burden would grow under uniform </w:t>
-      </w:r>
-    </w:p>
-    <w:p>
-      <w:pPr>
-        <w:spacing w:line="276" w:lineRule="auto" w:after="120"/>
-      </w:pPr>
-      <w:r>
-        <w:t xml:space="preserve">warming. The findings are directly relevant to the journal's scope of </w:t>
-      </w:r>
-    </w:p>
-    <w:p>
-      <w:pPr>
-        <w:spacing w:line="276" w:lineRule="auto" w:after="120"/>
-      </w:pPr>
-      <w:r>
-        <w:t xml:space="preserve">transportation-accident injury and the environmental and human factors that </w:t>
-      </w:r>
-    </w:p>
-    <w:p>
-      <w:pPr>
-        <w:spacing w:line="276" w:lineRule="auto" w:after="120"/>
-      </w:pPr>
-      <w:r>
-        <w:t>influence crash occurrence and severity.</w:t>
-      </w:r>
-    </w:p>
-    <w:p/>
-    <w:p>
-      <w:pPr>
-        <w:spacing w:line="276" w:lineRule="auto" w:after="120"/>
-      </w:pPr>
-      <w:r>
-        <w:t xml:space="preserve">The manuscript is original, is not under consideration elsewhere, and all authors </w:t>
-      </w:r>
-    </w:p>
-    <w:p>
-      <w:pPr>
-        <w:spacing w:line="276" w:lineRule="auto" w:after="120"/>
-      </w:pPr>
-      <w:r>
-        <w:t xml:space="preserve">approve submission. All data are public and the complete analysis pipeline is </w:t>
-      </w:r>
-    </w:p>
-    <w:p>
-      <w:pPr>
-        <w:spacing w:line="276" w:lineRule="auto" w:after="120"/>
-      </w:pPr>
-      <w:r>
-        <w:t xml:space="preserve">openly available and fully reproducible (make all), with no hard-coded results. </w:t>
-      </w:r>
-    </w:p>
-    <w:p>
-      <w:pPr>
-        <w:spacing w:line="276" w:lineRule="auto" w:after="120"/>
-      </w:pPr>
-      <w:r>
-        <w:t xml:space="preserve">We declare [PLACEHOLDER competing interests]. We confirm [PLACEHOLDER preprint </w:t>
-      </w:r>
-    </w:p>
-    <w:p>
-      <w:pPr>
-        <w:spacing w:line="276" w:lineRule="auto" w:after="120"/>
-      </w:pPr>
-      <w:r>
-        <w:t>status].</w:t>
-      </w:r>
-    </w:p>
-    <w:p/>
     <w:p>
       <w:pPr>
         <w:spacing w:line="276" w:lineRule="auto" w:after="120"/>
@@ -176,7 +58,6 @@
         <w:t>We look forward to your assessment.</w:t>
       </w:r>
     </w:p>
-    <w:p/>
     <w:p>
       <w:pPr>
         <w:spacing w:line="276" w:lineRule="auto" w:after="120"/>
@@ -185,7 +66,6 @@
         <w:t>Yours sincerely,</w:t>
       </w:r>
     </w:p>
-    <w:p/>
     <w:p>
       <w:pPr>
         <w:spacing w:line="276" w:lineRule="auto" w:after="120"/>

</xml_diff>

<commit_message>
AAP journal fit: prevention-framed title, practical implications, exploratory Japan comparison, updated highlights/cover letter
Co-Authored-By: Tatsuki Onishi <bougtoir@gmail.com>
</commit_message>
<xml_diff>
--- a/heat_accidents_mortality/output/manuscript/aap_cover_letter.docx
+++ b/heat_accidents_mortality/output/manuscript/aap_cover_letter.docx
@@ -31,7 +31,7 @@
         <w:spacing w:line="276" w:lineRule="auto" w:after="120"/>
       </w:pPr>
       <w:r>
-        <w:t>We submit for your consideration our manuscript, "Hotter-than-normal days and traffic-crash mortality: a distributed-lag analysis of the United States and Japan and the question of under-recognised heat illness", as a Research Article.</w:t>
+        <w:t>We submit for your consideration our manuscript, "Ambient heat as an under-recognised risk factor for US traffic-crash mortality: a distributed-lag analysis with an exploratory Japan comparison", as a Research Article.</w:t>
       </w:r>
     </w:p>
     <w:p>
@@ -39,7 +39,15 @@
         <w:spacing w:line="276" w:lineRule="auto" w:after="120"/>
       </w:pPr>
       <w:r>
-        <w:t>Using only public data, this ecological time-series study shows that days hotter than the local seasonal norm carry an acute excess of US traffic-crash deaths. The excess survives adjustment for national driving activity, is concentrated in heat-exposed open-air road users (motorcyclists, pedestrians and cyclists), and is comparable in magnitude to all officially recorded direct-heat deaths (ICD-10 X30). Scenario projections suggest this burden would grow under uniform warming. These findings are directly relevant to the journal's scope of transportation-accident injury and the environmental and human factors that influence crash occurrence and severity.</w:t>
+        <w:t>Climate change is increasing the frequency of dangerously hot days, yet the road safety field has paid little attention to ambient heat as a possible contributor to fatal crashes. Using only public data, this ecological time-series study shows that days hotter than the local seasonal norm carry an acute excess of US traffic-crash deaths. The excess survives adjustment for national driving activity, is concentrated in heat-exposed open-air road users—motorcyclists, pedestrians and cyclists—and is comparable in magnitude to all officially recorded direct-heat deaths (ICD-10 X30). Scenario projections suggest this burden would grow under uniform warming. Because these deaths continue to be coded as ordinary crashes, the heat contribution remains invisible to both heat-mortality surveillance and road-safety statistics, suggesting an uncounted opportunity for targeted prevention.</w:t>
+      </w:r>
+    </w:p>
+    <w:p>
+      <w:pPr>
+        <w:spacing w:line="276" w:lineRule="auto" w:after="120"/>
+      </w:pPr>
+      <w:r>
+        <w:t>We believe this work is a strong fit for Accident Analysis &amp; Prevention: it addresses the journal's core scope of transportation accident injury and the environmental and human factors that influence crash occurrence and severity, and it offers a concrete, actionable implication for heat-aware road safety messaging and climate adaptation.</w:t>
       </w:r>
     </w:p>
     <w:p>

</xml_diff>

<commit_message>
Fill AAP submission metadata placeholders (author, affiliation, COI, preprint, date, generative AI) and regenerate package
Co-Authored-By: Tatsuki Onishi <bougtoir@gmail.com>
</commit_message>
<xml_diff>
--- a/heat_accidents_mortality/output/manuscript/aap_cover_letter.docx
+++ b/heat_accidents_mortality/output/manuscript/aap_cover_letter.docx
@@ -7,7 +7,7 @@
         <w:spacing w:line="276" w:lineRule="auto" w:after="120"/>
       </w:pPr>
       <w:r>
-        <w:t>[PLACEHOLDER date]</w:t>
+        <w:t>22 August 2026</w:t>
       </w:r>
     </w:p>
     <w:p>
@@ -55,7 +55,7 @@
         <w:spacing w:line="276" w:lineRule="auto" w:after="120"/>
       </w:pPr>
       <w:r>
-        <w:t>The manuscript is original, is not under consideration elsewhere, and all authors approve submission. All data are public and the complete analysis pipeline is openly available and fully reproducible (make all for data and figures, then make aap for the manuscript and submission package), with no hard-coded results. We declare [PLACEHOLDER competing interests]. We confirm [PLACEHOLDER preprint status].</w:t>
+        <w:t>The manuscript is original, is not under consideration elsewhere, and all authors approve submission. All data are public and the complete analysis pipeline is openly available and fully reproducible (make all for data and figures, then make aap for the manuscript and submission package), with no hard-coded results. We declare no competing interests. We confirm that this manuscript has not been posted to a preprint server.</w:t>
       </w:r>
     </w:p>
     <w:p>
@@ -79,7 +79,7 @@
         <w:spacing w:line="276" w:lineRule="auto" w:after="120"/>
       </w:pPr>
       <w:r>
-        <w:t>[PLACEHOLDER corresponding author, on behalf of all authors]</w:t>
+        <w:t>Tatsuki Onishi, on behalf of all authors Data Science and AI Innovation Research Promotion Center Shiga University of Medical Science Seta Tsukinowa-cho, Otsu, Shiga 520-2192, Japan E-mail: bougtoir@gmail.com</w:t>
       </w:r>
     </w:p>
     <w:sectPr>

</xml_diff>